<commit_message>
Updated syllabus with mention of AI policy
</commit_message>
<xml_diff>
--- a/schedule/syllabus_2026_spring.docx
+++ b/schedule/syllabus_2026_spring.docx
@@ -51,7 +51,7 @@
           <w:sz w:val="24"/>
           <w:szCs w:val="24"/>
         </w:rPr>
-        <w:t> </w:t>
+        <w:t xml:space="preserve"> </w:t>
       </w:r>
       <w:r>
         <w:rPr>
@@ -61,17 +61,7 @@
           <w:sz w:val="24"/>
           <w:szCs w:val="24"/>
         </w:rPr>
-        <w:t>Spring 202</w:t>
-      </w:r>
-      <w:r>
-        <w:rPr>
-          <w:rFonts w:ascii="Cambria" w:hAnsi="Cambria" w:asciiTheme="minorHAnsi" w:hAnsiTheme="minorHAnsi"/>
-          <w:iCs/>
-          <w:color w:val="000000"/>
-          <w:sz w:val="24"/>
-          <w:szCs w:val="24"/>
-        </w:rPr>
-        <w:t>6</w:t>
+        <w:t>Spring 2026</w:t>
       </w:r>
     </w:p>
     <w:p>
@@ -1187,6 +1177,59 @@
         </w:rPr>
       </w:pPr>
       <w:r>
+        <w:rPr/>
+      </w:r>
+    </w:p>
+    <w:p>
+      <w:pPr>
+        <w:pStyle w:val="Normal"/>
+        <w:rPr>
+          <w:sz w:val="22"/>
+          <w:szCs w:val="22"/>
+        </w:rPr>
+      </w:pPr>
+      <w:r>
+        <w:rPr>
+          <w:sz w:val="22"/>
+          <w:szCs w:val="22"/>
+        </w:rPr>
+        <w:t>AI Policy</w:t>
+      </w:r>
+      <w:r>
+        <w:rPr>
+          <w:sz w:val="22"/>
+          <w:szCs w:val="22"/>
+        </w:rPr>
+        <w:t>:</w:t>
+      </w:r>
+    </w:p>
+    <w:p>
+      <w:pPr>
+        <w:pStyle w:val="Normal"/>
+        <w:ind w:hanging="0" w:left="360"/>
+        <w:rPr>
+          <w:sz w:val="20"/>
+          <w:szCs w:val="20"/>
+        </w:rPr>
+      </w:pPr>
+      <w:r>
+        <w:rPr>
+          <w:sz w:val="20"/>
+          <w:szCs w:val="20"/>
+        </w:rPr>
+        <w:t>The use of AI in this class is governed by the AI Policy document (https://github.com/AaronParsons/ugradio/raw/main/schedule/ai_policy.docx) which is also linked from the AstroBaki course page. Please familiarize yourself with it.</w:t>
+      </w:r>
+    </w:p>
+    <w:p>
+      <w:pPr>
+        <w:pStyle w:val="Normal"/>
+        <w:ind w:hanging="0" w:left="360"/>
+        <w:rPr>
+          <w:sz w:val="20"/>
+          <w:szCs w:val="20"/>
+        </w:rPr>
+      </w:pPr>
+      <w:r>
         <w:rPr>
           <w:sz w:val="20"/>
           <w:szCs w:val="20"/>
@@ -1229,21 +1272,7 @@
           <w:sz w:val="20"/>
           <w:szCs w:val="20"/>
         </w:rPr>
-        <w:t>We are committed to ensuring that every student in our department is able to engage in our courses without incurring undue financial burdens. If you are in need of a personal laptop or other technology to complete academic work this semester, the Student Technology Equity Program (STEP) can provide need-based loans for a variety of hardware to Berkeley students. Applications are now open for the Spring 202</w:t>
-      </w:r>
-      <w:r>
-        <w:rPr>
-          <w:sz w:val="20"/>
-          <w:szCs w:val="20"/>
-        </w:rPr>
-        <w:t>6</w:t>
-      </w:r>
-      <w:r>
-        <w:rPr>
-          <w:sz w:val="20"/>
-          <w:szCs w:val="20"/>
-        </w:rPr>
-        <w:t xml:space="preserve"> semester: </w:t>
+        <w:t xml:space="preserve">We are committed to ensuring that every student in our department is able to engage in our courses without incurring undue financial burdens. If you are in need of a personal laptop or other technology to complete academic work this semester, the Student Technology Equity Program (STEP) can provide need-based loans for a variety of hardware to Berkeley students. Applications are now open for the Spring 2026 semester: </w:t>
       </w:r>
       <w:hyperlink r:id="rId5">
         <w:r>
@@ -2428,7 +2457,7 @@
   <w:docDefaults>
     <w:rPrDefault>
       <w:rPr>
-        <w:rFonts w:ascii="Cambria" w:hAnsi="Cambria" w:eastAsia="ＭＳ 明朝" w:cs="" w:asciiTheme="minorHAnsi" w:cstheme="minorBidi" w:eastAsiaTheme="minorEastAsia" w:hAnsiTheme="minorHAnsi"/>
+        <w:rFonts w:ascii="Cambria" w:hAnsi="Cambria" w:eastAsia="" w:cs="" w:asciiTheme="minorHAnsi" w:cstheme="minorBidi" w:eastAsiaTheme="minorEastAsia" w:hAnsiTheme="minorHAnsi"/>
         <w:szCs w:val="24"/>
         <w:lang w:val="en-US" w:eastAsia="en-US" w:bidi="ar-SA"/>
       </w:rPr>
@@ -2834,7 +2863,7 @@
       <w:jc w:val="left"/>
     </w:pPr>
     <w:rPr>
-      <w:rFonts w:ascii="Cambria" w:hAnsi="Cambria" w:eastAsia="ＭＳ 明朝" w:cs="" w:asciiTheme="minorHAnsi" w:cstheme="minorBidi" w:eastAsiaTheme="minorEastAsia" w:hAnsiTheme="minorHAnsi"/>
+      <w:rFonts w:ascii="Cambria" w:hAnsi="Cambria" w:eastAsia="" w:cs="" w:asciiTheme="minorHAnsi" w:cstheme="minorBidi" w:eastAsiaTheme="minorEastAsia" w:hAnsiTheme="minorHAnsi"/>
       <w:color w:val="auto"/>
       <w:kern w:val="0"/>
       <w:sz w:val="24"/>

</xml_diff>